<commit_message>
Documentation - FVG Indicator added to all relevant docs.
</commit_message>
<xml_diff>
--- a/Joshua_Terminal_Guide.docx
+++ b/Joshua_Terminal_Guide.docx
@@ -275,7 +275,7 @@
                 <w:sz w:val="18"/>
                 <w:szCs w:val="18"/>
               </w:rPr>
-              <w:t xml:space="preserve">27+ indicators
+              <w:t xml:space="preserve">28+ indicators
 All computed client-side</w:t>
             </w:r>
           </w:p>
@@ -9418,7 +9418,63 @@
                 <w:sz w:val="18"/>
                 <w:szCs w:val="18"/>
               </w:rPr>
-              <w:t xml:space="preserve">Detects institutional order blocks — bearish (red) and bullish (green) with optional BOS lines.</w:t>
+              <w:t xml:space="preserve">Detects institutional order blocks — bearish (gold) and bullish (green) with optional BOS lines. Mitigated blocks fade to grey.</w:t>
+            </w:r>
+          </w:p>
+        </w:tc>
+      </w:tr>
+      <w:tr>
+        <w:tc>
+          <w:tcPr>
+            <w:tcW w:type="dxa" w:w="2800"/>
+            <w:tcBorders>
+              <w:top w:val="nil" w:color="auto" w:sz="0"/>
+              <w:left w:val="nil" w:color="auto" w:sz="0"/>
+              <w:bottom w:val="single" w:color="1E2535" w:sz="1"/>
+              <w:right w:val="nil" w:color="auto" w:sz="0"/>
+            </w:tcBorders>
+            <w:shd w:fill="0A0C0F" w:val="solid"/>
+            <w:vAlign w:val="center"/>
+          </w:tcPr>
+          <w:p>
+            <w:pPr>
+              <w:spacing w:after="40" w:before="40"/>
+            </w:pPr>
+            <w:r>
+              <w:rPr>
+                <w:rFonts w:ascii="Arial" w:cs="Arial" w:eastAsia="Arial" w:hAnsi="Arial"/>
+                <w:color w:val="D4DBE8"/>
+                <w:sz w:val="18"/>
+                <w:szCs w:val="18"/>
+              </w:rPr>
+              <w:t xml:space="preserve">Fair Value Gap (FVG)</w:t>
+            </w:r>
+          </w:p>
+        </w:tc>
+        <w:tc>
+          <w:tcPr>
+            <w:tcW w:type="dxa" w:w="6200"/>
+            <w:tcBorders>
+              <w:top w:val="nil" w:color="auto" w:sz="0"/>
+              <w:left w:val="nil" w:color="auto" w:sz="0"/>
+              <w:bottom w:val="single" w:color="1E2535" w:sz="1"/>
+              <w:right w:val="nil" w:color="auto" w:sz="0"/>
+            </w:tcBorders>
+            <w:shd w:fill="0A0C0F" w:val="solid"/>
+            <w:vAlign w:val="center"/>
+          </w:tcPr>
+          <w:p>
+            <w:pPr>
+              <w:spacing w:after="40" w:before="40"/>
+            </w:pPr>
+            <w:r>
+              <w:rPr>
+                <w:rFonts w:ascii="Arial" w:cs="Arial" w:eastAsia="Arial" w:hAnsi="Arial"/>
+                <w:color w:val="D4DBE8"/>
+                <w:sz w:val="18"/>
+                <w:szCs w:val="18"/>
+              </w:rPr>
+              <w:t xml:space="preserve">Detects three-candle price imbalances (LuxAlgo-style). Bullish FVGs (teal) form when price gaps up; bearish FVGs (red) when price gaps down. Mitigated when price closes through the gap. Shows dashed lines at mitigated edges. Optional dynamic level lines. Extends 20 bars forward for unmitigated gaps.</w:t>
             </w:r>
           </w:p>
         </w:tc>

</xml_diff>